<commit_message>
docs: set PRD v3.0/v3.2 body font to 10pt
Co-Authored-By: Claude Opus 4.8 (1M context) <noreply@anthropic.com>
</commit_message>
<xml_diff>
--- a/docs/prd/ai4ceo-portal-PRD-v3_0.docx
+++ b/docs/prd/ai4ceo-portal-PRD-v3_0.docx
@@ -32228,8 +32228,8 @@
     <w:rPrDefault>
       <w:rPr>
         <w:rFonts w:asciiTheme="minorHAnsi" w:cstheme="minorBidi" w:eastAsiaTheme="minorHAnsi" w:hAnsiTheme="minorHAnsi"/>
-        <w:sz w:val="24"/>
-        <w:szCs w:val="24"/>
+        <w:sz w:val="20"/>
+        <w:szCs w:val="20"/>
         <w:lang w:bidi="ar-SA" w:eastAsia="en-US" w:val="en-US"/>
       </w:rPr>
     </w:rPrDefault>

</xml_diff>